<commit_message>
update: Subida de primeros archivos LaTeX
</commit_message>
<xml_diff>
--- a/PRESENTACION-1BIM/Documento de Análisis de Reto.docx
+++ b/PRESENTACION-1BIM/Documento de Análisis de Reto.docx
@@ -106,7 +106,27 @@
               <w:sz w:val="40"/>
               <w:szCs w:val="40"/>
             </w:rPr>
-            <w:t>ISBEN Solutions – Plataforma Digital</w:t>
+            <w:t xml:space="preserve">ISBEN </w:t>
+          </w:r>
+          <w:proofErr w:type="spellStart"/>
+          <w:r>
+            <w:rPr>
+              <w:rStyle w:val="eop"/>
+              <w:rFonts w:ascii="Arial" w:hAnsi="Arial" w:cs="Arial"/>
+              <w:sz w:val="40"/>
+              <w:szCs w:val="40"/>
+            </w:rPr>
+            <w:t>Solutions</w:t>
+          </w:r>
+          <w:proofErr w:type="spellEnd"/>
+          <w:r>
+            <w:rPr>
+              <w:rStyle w:val="eop"/>
+              <w:rFonts w:ascii="Arial" w:hAnsi="Arial" w:cs="Arial"/>
+              <w:sz w:val="40"/>
+              <w:szCs w:val="40"/>
+            </w:rPr>
+            <w:t xml:space="preserve"> – Plataforma Digital</w:t>
           </w:r>
         </w:p>
         <w:p>
@@ -583,10 +603,17 @@
           <w:pPr>
             <w:pStyle w:val="TDC1"/>
             <w:tabs>
+              <w:tab w:val="left" w:pos="480"/>
               <w:tab w:val="right" w:leader="dot" w:pos="8828"/>
             </w:tabs>
             <w:rPr>
+              <w:rFonts w:eastAsiaTheme="minorEastAsia"/>
               <w:noProof/>
+              <w:kern w:val="2"/>
+              <w:sz w:val="24"/>
+              <w:szCs w:val="24"/>
+              <w:lang w:val="es-EC" w:eastAsia="es-EC"/>
+              <w14:ligatures w14:val="standardContextual"/>
             </w:rPr>
           </w:pPr>
           <w:r>
@@ -598,24 +625,44 @@
           <w:r>
             <w:fldChar w:fldCharType="separate"/>
           </w:r>
-          <w:hyperlink w:anchor="_Toc230596351" w:history="1">
+          <w:hyperlink w:anchor="_Toc231069585" w:history="1">
             <w:r>
               <w:rPr>
                 <w:rStyle w:val="Hipervnculo"/>
-                <w:rFonts w:eastAsia="Arial"/>
-                <w:noProof/>
-              </w:rPr>
-              <w:t>1. Introducción</w:t>
-            </w:r>
-            <w:r>
-              <w:rPr>
-                <w:noProof/>
-                <w:webHidden/>
+                <w:rFonts w:ascii="Arial" w:eastAsia="Arial" w:hAnsi="Arial" w:cs="Arial"/>
+                <w:noProof/>
+              </w:rPr>
+              <w:t>1.</w:t>
+            </w:r>
+            <w:r>
+              <w:rPr>
+                <w:rFonts w:eastAsiaTheme="minorEastAsia"/>
+                <w:noProof/>
+                <w:kern w:val="2"/>
+                <w:sz w:val="24"/>
+                <w:szCs w:val="24"/>
+                <w:lang w:val="es-EC" w:eastAsia="es-EC"/>
+                <w14:ligatures w14:val="standardContextual"/>
               </w:rPr>
               <w:tab/>
             </w:r>
             <w:r>
               <w:rPr>
+                <w:rStyle w:val="Hipervnculo"/>
+                <w:rFonts w:ascii="Arial" w:eastAsia="Arial" w:hAnsi="Arial" w:cs="Arial"/>
+                <w:noProof/>
+              </w:rPr>
+              <w:t>Capítulo 1: Generalidades del Proyecto</w:t>
+            </w:r>
+            <w:r>
+              <w:rPr>
+                <w:noProof/>
+                <w:webHidden/>
+              </w:rPr>
+              <w:tab/>
+            </w:r>
+            <w:r>
+              <w:rPr>
                 <w:noProof/>
                 <w:webHidden/>
               </w:rPr>
@@ -626,75 +673,7 @@
                 <w:noProof/>
                 <w:webHidden/>
               </w:rPr>
-              <w:instrText xml:space="preserve"> PAGEREF _Toc230596351 \h </w:instrText>
-            </w:r>
-            <w:r>
-              <w:rPr>
-                <w:noProof/>
-                <w:webHidden/>
-              </w:rPr>
-            </w:r>
-            <w:r>
-              <w:rPr>
-                <w:noProof/>
-                <w:webHidden/>
-              </w:rPr>
-              <w:fldChar w:fldCharType="separate"/>
-            </w:r>
-            <w:r>
-              <w:rPr>
-                <w:noProof/>
-                <w:webHidden/>
-              </w:rPr>
-              <w:t>3</w:t>
-            </w:r>
-            <w:r>
-              <w:rPr>
-                <w:noProof/>
-                <w:webHidden/>
-              </w:rPr>
-              <w:fldChar w:fldCharType="end"/>
-            </w:r>
-          </w:hyperlink>
-        </w:p>
-        <w:p>
-          <w:pPr>
-            <w:pStyle w:val="TDC2"/>
-            <w:tabs>
-              <w:tab w:val="right" w:leader="dot" w:pos="8828"/>
-            </w:tabs>
-            <w:rPr>
-              <w:noProof/>
-            </w:rPr>
-          </w:pPr>
-          <w:hyperlink w:anchor="_Toc230596352" w:history="1">
-            <w:r>
-              <w:rPr>
-                <w:rStyle w:val="Hipervnculo"/>
-                <w:noProof/>
-              </w:rPr>
-              <w:t>1.1. Propósito del documento</w:t>
-            </w:r>
-            <w:r>
-              <w:rPr>
-                <w:noProof/>
-                <w:webHidden/>
-              </w:rPr>
-              <w:tab/>
-            </w:r>
-            <w:r>
-              <w:rPr>
-                <w:noProof/>
-                <w:webHidden/>
-              </w:rPr>
-              <w:fldChar w:fldCharType="begin"/>
-            </w:r>
-            <w:r>
-              <w:rPr>
-                <w:noProof/>
-                <w:webHidden/>
-              </w:rPr>
-              <w:instrText xml:space="preserve"> PAGEREF _Toc230596352 \h </w:instrText>
+              <w:instrText xml:space="preserve"> PAGEREF _Toc231069585 \h </w:instrText>
             </w:r>
             <w:r>
               <w:rPr>
@@ -729,30 +708,57 @@
           <w:pPr>
             <w:pStyle w:val="TDC1"/>
             <w:tabs>
+              <w:tab w:val="left" w:pos="720"/>
               <w:tab w:val="right" w:leader="dot" w:pos="8828"/>
             </w:tabs>
             <w:rPr>
+              <w:rFonts w:eastAsiaTheme="minorEastAsia"/>
               <w:noProof/>
+              <w:kern w:val="2"/>
+              <w:sz w:val="24"/>
+              <w:szCs w:val="24"/>
+              <w:lang w:val="es-EC" w:eastAsia="es-EC"/>
+              <w14:ligatures w14:val="standardContextual"/>
             </w:rPr>
           </w:pPr>
-          <w:hyperlink w:anchor="_Toc230596353" w:history="1">
+          <w:hyperlink w:anchor="_Toc231069586" w:history="1">
             <w:r>
               <w:rPr>
                 <w:rStyle w:val="Hipervnculo"/>
-                <w:rFonts w:eastAsia="Arial"/>
-                <w:noProof/>
-              </w:rPr>
-              <w:t>2. Declaración del Problema (Problem Statement)</w:t>
-            </w:r>
-            <w:r>
-              <w:rPr>
-                <w:noProof/>
-                <w:webHidden/>
+                <w:rFonts w:ascii="Arial" w:eastAsia="Arial" w:hAnsi="Arial" w:cs="Arial"/>
+                <w:noProof/>
+              </w:rPr>
+              <w:t>1.1.</w:t>
+            </w:r>
+            <w:r>
+              <w:rPr>
+                <w:rFonts w:eastAsiaTheme="minorEastAsia"/>
+                <w:noProof/>
+                <w:kern w:val="2"/>
+                <w:sz w:val="24"/>
+                <w:szCs w:val="24"/>
+                <w:lang w:val="es-EC" w:eastAsia="es-EC"/>
+                <w14:ligatures w14:val="standardContextual"/>
               </w:rPr>
               <w:tab/>
             </w:r>
             <w:r>
               <w:rPr>
+                <w:rStyle w:val="Hipervnculo"/>
+                <w:rFonts w:ascii="Arial" w:hAnsi="Arial" w:cs="Arial"/>
+                <w:noProof/>
+              </w:rPr>
+              <w:t>Introducción</w:t>
+            </w:r>
+            <w:r>
+              <w:rPr>
+                <w:noProof/>
+                <w:webHidden/>
+              </w:rPr>
+              <w:tab/>
+            </w:r>
+            <w:r>
+              <w:rPr>
                 <w:noProof/>
                 <w:webHidden/>
               </w:rPr>
@@ -763,7 +769,7 @@
                 <w:noProof/>
                 <w:webHidden/>
               </w:rPr>
-              <w:instrText xml:space="preserve"> PAGEREF _Toc230596353 \h </w:instrText>
+              <w:instrText xml:space="preserve"> PAGEREF _Toc231069586 \h </w:instrText>
             </w:r>
             <w:r>
               <w:rPr>
@@ -798,30 +804,57 @@
           <w:pPr>
             <w:pStyle w:val="TDC1"/>
             <w:tabs>
+              <w:tab w:val="left" w:pos="720"/>
               <w:tab w:val="right" w:leader="dot" w:pos="8828"/>
             </w:tabs>
             <w:rPr>
+              <w:rFonts w:eastAsiaTheme="minorEastAsia"/>
               <w:noProof/>
+              <w:kern w:val="2"/>
+              <w:sz w:val="24"/>
+              <w:szCs w:val="24"/>
+              <w:lang w:val="es-EC" w:eastAsia="es-EC"/>
+              <w14:ligatures w14:val="standardContextual"/>
             </w:rPr>
           </w:pPr>
-          <w:hyperlink w:anchor="_Toc230596354" w:history="1">
+          <w:hyperlink w:anchor="_Toc231069587" w:history="1">
             <w:r>
               <w:rPr>
                 <w:rStyle w:val="Hipervnculo"/>
-                <w:rFonts w:eastAsia="Arial"/>
-                <w:noProof/>
-              </w:rPr>
-              <w:t>3. Enunciado de Visión del Producto</w:t>
-            </w:r>
-            <w:r>
-              <w:rPr>
-                <w:noProof/>
-                <w:webHidden/>
+                <w:rFonts w:ascii="Arial" w:hAnsi="Arial" w:cs="Arial"/>
+                <w:noProof/>
+              </w:rPr>
+              <w:t>1.2.</w:t>
+            </w:r>
+            <w:r>
+              <w:rPr>
+                <w:rFonts w:eastAsiaTheme="minorEastAsia"/>
+                <w:noProof/>
+                <w:kern w:val="2"/>
+                <w:sz w:val="24"/>
+                <w:szCs w:val="24"/>
+                <w:lang w:val="es-EC" w:eastAsia="es-EC"/>
+                <w14:ligatures w14:val="standardContextual"/>
               </w:rPr>
               <w:tab/>
             </w:r>
             <w:r>
               <w:rPr>
+                <w:rStyle w:val="Hipervnculo"/>
+                <w:rFonts w:ascii="Arial" w:hAnsi="Arial" w:cs="Arial"/>
+                <w:noProof/>
+              </w:rPr>
+              <w:t>Problemática</w:t>
+            </w:r>
+            <w:r>
+              <w:rPr>
+                <w:noProof/>
+                <w:webHidden/>
+              </w:rPr>
+              <w:tab/>
+            </w:r>
+            <w:r>
+              <w:rPr>
                 <w:noProof/>
                 <w:webHidden/>
               </w:rPr>
@@ -832,7 +865,7 @@
                 <w:noProof/>
                 <w:webHidden/>
               </w:rPr>
-              <w:instrText xml:space="preserve"> PAGEREF _Toc230596354 \h </w:instrText>
+              <w:instrText xml:space="preserve"> PAGEREF _Toc231069587 \h </w:instrText>
             </w:r>
             <w:r>
               <w:rPr>
@@ -867,30 +900,57 @@
           <w:pPr>
             <w:pStyle w:val="TDC1"/>
             <w:tabs>
+              <w:tab w:val="left" w:pos="720"/>
               <w:tab w:val="right" w:leader="dot" w:pos="8828"/>
             </w:tabs>
             <w:rPr>
+              <w:rFonts w:eastAsiaTheme="minorEastAsia"/>
               <w:noProof/>
+              <w:kern w:val="2"/>
+              <w:sz w:val="24"/>
+              <w:szCs w:val="24"/>
+              <w:lang w:val="es-EC" w:eastAsia="es-EC"/>
+              <w14:ligatures w14:val="standardContextual"/>
             </w:rPr>
           </w:pPr>
-          <w:hyperlink w:anchor="_Toc230596355" w:history="1">
+          <w:hyperlink w:anchor="_Toc231069588" w:history="1">
             <w:r>
               <w:rPr>
                 <w:rStyle w:val="Hipervnculo"/>
-                <w:rFonts w:eastAsia="Arial"/>
-                <w:noProof/>
-              </w:rPr>
-              <w:t>4. Análisis de Interesados (Stakeholders)</w:t>
-            </w:r>
-            <w:r>
-              <w:rPr>
-                <w:noProof/>
-                <w:webHidden/>
+                <w:rFonts w:ascii="Arial" w:hAnsi="Arial" w:cs="Arial"/>
+                <w:noProof/>
+              </w:rPr>
+              <w:t>1.3.</w:t>
+            </w:r>
+            <w:r>
+              <w:rPr>
+                <w:rFonts w:eastAsiaTheme="minorEastAsia"/>
+                <w:noProof/>
+                <w:kern w:val="2"/>
+                <w:sz w:val="24"/>
+                <w:szCs w:val="24"/>
+                <w:lang w:val="es-EC" w:eastAsia="es-EC"/>
+                <w14:ligatures w14:val="standardContextual"/>
               </w:rPr>
               <w:tab/>
             </w:r>
             <w:r>
               <w:rPr>
+                <w:rStyle w:val="Hipervnculo"/>
+                <w:rFonts w:ascii="Arial" w:hAnsi="Arial" w:cs="Arial"/>
+                <w:noProof/>
+              </w:rPr>
+              <w:t>Metodología o estrategia de desarrollo</w:t>
+            </w:r>
+            <w:r>
+              <w:rPr>
+                <w:noProof/>
+                <w:webHidden/>
+              </w:rPr>
+              <w:tab/>
+            </w:r>
+            <w:r>
+              <w:rPr>
                 <w:noProof/>
                 <w:webHidden/>
               </w:rPr>
@@ -901,7 +961,7 @@
                 <w:noProof/>
                 <w:webHidden/>
               </w:rPr>
-              <w:instrText xml:space="preserve"> PAGEREF _Toc230596355 \h </w:instrText>
+              <w:instrText xml:space="preserve"> PAGEREF _Toc231069588 \h </w:instrText>
             </w:r>
             <w:r>
               <w:rPr>
@@ -921,7 +981,7 @@
                 <w:noProof/>
                 <w:webHidden/>
               </w:rPr>
-              <w:t>4</w:t>
+              <w:t>3</w:t>
             </w:r>
             <w:r>
               <w:rPr>
@@ -936,30 +996,57 @@
           <w:pPr>
             <w:pStyle w:val="TDC1"/>
             <w:tabs>
+              <w:tab w:val="left" w:pos="480"/>
               <w:tab w:val="right" w:leader="dot" w:pos="8828"/>
             </w:tabs>
             <w:rPr>
+              <w:rFonts w:eastAsiaTheme="minorEastAsia"/>
               <w:noProof/>
+              <w:kern w:val="2"/>
+              <w:sz w:val="24"/>
+              <w:szCs w:val="24"/>
+              <w:lang w:val="es-EC" w:eastAsia="es-EC"/>
+              <w14:ligatures w14:val="standardContextual"/>
             </w:rPr>
           </w:pPr>
-          <w:hyperlink w:anchor="_Toc230596356" w:history="1">
+          <w:hyperlink w:anchor="_Toc231069589" w:history="1">
             <w:r>
               <w:rPr>
                 <w:rStyle w:val="Hipervnculo"/>
-                <w:rFonts w:eastAsia="Arial"/>
-                <w:noProof/>
-              </w:rPr>
-              <w:t>5. Declaración del Alcance (Scope Statement)</w:t>
-            </w:r>
-            <w:r>
-              <w:rPr>
-                <w:noProof/>
-                <w:webHidden/>
+                <w:rFonts w:ascii="Arial" w:eastAsia="Arial" w:hAnsi="Arial" w:cs="Arial"/>
+                <w:noProof/>
+              </w:rPr>
+              <w:t>2.</w:t>
+            </w:r>
+            <w:r>
+              <w:rPr>
+                <w:rFonts w:eastAsiaTheme="minorEastAsia"/>
+                <w:noProof/>
+                <w:kern w:val="2"/>
+                <w:sz w:val="24"/>
+                <w:szCs w:val="24"/>
+                <w:lang w:val="es-EC" w:eastAsia="es-EC"/>
+                <w14:ligatures w14:val="standardContextual"/>
               </w:rPr>
               <w:tab/>
             </w:r>
             <w:r>
               <w:rPr>
+                <w:rStyle w:val="Hipervnculo"/>
+                <w:rFonts w:ascii="Arial" w:eastAsia="Arial" w:hAnsi="Arial" w:cs="Arial"/>
+                <w:noProof/>
+              </w:rPr>
+              <w:t>Capítulo 2: Planificación y Análisis</w:t>
+            </w:r>
+            <w:r>
+              <w:rPr>
+                <w:noProof/>
+                <w:webHidden/>
+              </w:rPr>
+              <w:tab/>
+            </w:r>
+            <w:r>
+              <w:rPr>
                 <w:noProof/>
                 <w:webHidden/>
               </w:rPr>
@@ -970,7 +1057,7 @@
                 <w:noProof/>
                 <w:webHidden/>
               </w:rPr>
-              <w:instrText xml:space="preserve"> PAGEREF _Toc230596356 \h </w:instrText>
+              <w:instrText xml:space="preserve"> PAGEREF _Toc231069589 \h </w:instrText>
             </w:r>
             <w:r>
               <w:rPr>
@@ -990,7 +1077,871 @@
                 <w:noProof/>
                 <w:webHidden/>
               </w:rPr>
+              <w:t>4</w:t>
+            </w:r>
+            <w:r>
+              <w:rPr>
+                <w:noProof/>
+                <w:webHidden/>
+              </w:rPr>
+              <w:fldChar w:fldCharType="end"/>
+            </w:r>
+          </w:hyperlink>
+        </w:p>
+        <w:p>
+          <w:pPr>
+            <w:pStyle w:val="TDC1"/>
+            <w:tabs>
+              <w:tab w:val="left" w:pos="720"/>
+              <w:tab w:val="right" w:leader="dot" w:pos="8828"/>
+            </w:tabs>
+            <w:rPr>
+              <w:rFonts w:eastAsiaTheme="minorEastAsia"/>
+              <w:noProof/>
+              <w:kern w:val="2"/>
+              <w:sz w:val="24"/>
+              <w:szCs w:val="24"/>
+              <w:lang w:val="es-EC" w:eastAsia="es-EC"/>
+              <w14:ligatures w14:val="standardContextual"/>
+            </w:rPr>
+          </w:pPr>
+          <w:hyperlink w:anchor="_Toc231069590" w:history="1">
+            <w:r>
+              <w:rPr>
+                <w:rStyle w:val="Hipervnculo"/>
+                <w:rFonts w:ascii="Arial" w:hAnsi="Arial" w:cs="Arial"/>
+                <w:noProof/>
+              </w:rPr>
+              <w:t>2.1.</w:t>
+            </w:r>
+            <w:r>
+              <w:rPr>
+                <w:rFonts w:eastAsiaTheme="minorEastAsia"/>
+                <w:noProof/>
+                <w:kern w:val="2"/>
+                <w:sz w:val="24"/>
+                <w:szCs w:val="24"/>
+                <w:lang w:val="es-EC" w:eastAsia="es-EC"/>
+                <w14:ligatures w14:val="standardContextual"/>
+              </w:rPr>
+              <w:tab/>
+            </w:r>
+            <w:r>
+              <w:rPr>
+                <w:rStyle w:val="Hipervnculo"/>
+                <w:rFonts w:ascii="Arial" w:hAnsi="Arial" w:cs="Arial"/>
+                <w:noProof/>
+              </w:rPr>
+              <w:t>Análisis</w:t>
+            </w:r>
+            <w:r>
+              <w:rPr>
+                <w:noProof/>
+                <w:webHidden/>
+              </w:rPr>
+              <w:tab/>
+            </w:r>
+            <w:r>
+              <w:rPr>
+                <w:noProof/>
+                <w:webHidden/>
+              </w:rPr>
+              <w:fldChar w:fldCharType="begin"/>
+            </w:r>
+            <w:r>
+              <w:rPr>
+                <w:noProof/>
+                <w:webHidden/>
+              </w:rPr>
+              <w:instrText xml:space="preserve"> PAGEREF _Toc231069590 \h </w:instrText>
+            </w:r>
+            <w:r>
+              <w:rPr>
+                <w:noProof/>
+                <w:webHidden/>
+              </w:rPr>
+            </w:r>
+            <w:r>
+              <w:rPr>
+                <w:noProof/>
+                <w:webHidden/>
+              </w:rPr>
+              <w:fldChar w:fldCharType="separate"/>
+            </w:r>
+            <w:r>
+              <w:rPr>
+                <w:noProof/>
+                <w:webHidden/>
+              </w:rPr>
+              <w:t>4</w:t>
+            </w:r>
+            <w:r>
+              <w:rPr>
+                <w:noProof/>
+                <w:webHidden/>
+              </w:rPr>
+              <w:fldChar w:fldCharType="end"/>
+            </w:r>
+          </w:hyperlink>
+        </w:p>
+        <w:p>
+          <w:pPr>
+            <w:pStyle w:val="TDC1"/>
+            <w:tabs>
+              <w:tab w:val="left" w:pos="720"/>
+              <w:tab w:val="right" w:leader="dot" w:pos="8828"/>
+            </w:tabs>
+            <w:rPr>
+              <w:rFonts w:eastAsiaTheme="minorEastAsia"/>
+              <w:noProof/>
+              <w:kern w:val="2"/>
+              <w:sz w:val="24"/>
+              <w:szCs w:val="24"/>
+              <w:lang w:val="es-EC" w:eastAsia="es-EC"/>
+              <w14:ligatures w14:val="standardContextual"/>
+            </w:rPr>
+          </w:pPr>
+          <w:hyperlink w:anchor="_Toc231069591" w:history="1">
+            <w:r>
+              <w:rPr>
+                <w:rStyle w:val="Hipervnculo"/>
+                <w:rFonts w:ascii="Arial" w:hAnsi="Arial" w:cs="Arial"/>
+                <w:noProof/>
+              </w:rPr>
+              <w:t>2.2.</w:t>
+            </w:r>
+            <w:r>
+              <w:rPr>
+                <w:rFonts w:eastAsiaTheme="minorEastAsia"/>
+                <w:noProof/>
+                <w:kern w:val="2"/>
+                <w:sz w:val="24"/>
+                <w:szCs w:val="24"/>
+                <w:lang w:val="es-EC" w:eastAsia="es-EC"/>
+                <w14:ligatures w14:val="standardContextual"/>
+              </w:rPr>
+              <w:tab/>
+            </w:r>
+            <w:r>
+              <w:rPr>
+                <w:rStyle w:val="Hipervnculo"/>
+                <w:rFonts w:ascii="Arial" w:hAnsi="Arial" w:cs="Arial"/>
+                <w:noProof/>
+              </w:rPr>
+              <w:t>Requisitos funcionales</w:t>
+            </w:r>
+            <w:r>
+              <w:rPr>
+                <w:noProof/>
+                <w:webHidden/>
+              </w:rPr>
+              <w:tab/>
+            </w:r>
+            <w:r>
+              <w:rPr>
+                <w:noProof/>
+                <w:webHidden/>
+              </w:rPr>
+              <w:fldChar w:fldCharType="begin"/>
+            </w:r>
+            <w:r>
+              <w:rPr>
+                <w:noProof/>
+                <w:webHidden/>
+              </w:rPr>
+              <w:instrText xml:space="preserve"> PAGEREF _Toc231069591 \h </w:instrText>
+            </w:r>
+            <w:r>
+              <w:rPr>
+                <w:noProof/>
+                <w:webHidden/>
+              </w:rPr>
+            </w:r>
+            <w:r>
+              <w:rPr>
+                <w:noProof/>
+                <w:webHidden/>
+              </w:rPr>
+              <w:fldChar w:fldCharType="separate"/>
+            </w:r>
+            <w:r>
+              <w:rPr>
+                <w:noProof/>
+                <w:webHidden/>
+              </w:rPr>
+              <w:t>4</w:t>
+            </w:r>
+            <w:r>
+              <w:rPr>
+                <w:noProof/>
+                <w:webHidden/>
+              </w:rPr>
+              <w:fldChar w:fldCharType="end"/>
+            </w:r>
+          </w:hyperlink>
+        </w:p>
+        <w:p>
+          <w:pPr>
+            <w:pStyle w:val="TDC1"/>
+            <w:tabs>
+              <w:tab w:val="left" w:pos="720"/>
+              <w:tab w:val="right" w:leader="dot" w:pos="8828"/>
+            </w:tabs>
+            <w:rPr>
+              <w:rFonts w:eastAsiaTheme="minorEastAsia"/>
+              <w:noProof/>
+              <w:kern w:val="2"/>
+              <w:sz w:val="24"/>
+              <w:szCs w:val="24"/>
+              <w:lang w:val="es-EC" w:eastAsia="es-EC"/>
+              <w14:ligatures w14:val="standardContextual"/>
+            </w:rPr>
+          </w:pPr>
+          <w:hyperlink w:anchor="_Toc231069592" w:history="1">
+            <w:r>
+              <w:rPr>
+                <w:rStyle w:val="Hipervnculo"/>
+                <w:rFonts w:ascii="Arial" w:hAnsi="Arial" w:cs="Arial"/>
+                <w:noProof/>
+              </w:rPr>
+              <w:t>2.3.</w:t>
+            </w:r>
+            <w:r>
+              <w:rPr>
+                <w:rFonts w:eastAsiaTheme="minorEastAsia"/>
+                <w:noProof/>
+                <w:kern w:val="2"/>
+                <w:sz w:val="24"/>
+                <w:szCs w:val="24"/>
+                <w:lang w:val="es-EC" w:eastAsia="es-EC"/>
+                <w14:ligatures w14:val="standardContextual"/>
+              </w:rPr>
+              <w:tab/>
+            </w:r>
+            <w:r>
+              <w:rPr>
+                <w:rStyle w:val="Hipervnculo"/>
+                <w:rFonts w:ascii="Arial" w:hAnsi="Arial" w:cs="Arial"/>
+                <w:noProof/>
+              </w:rPr>
+              <w:t>Requisitos no funcionales</w:t>
+            </w:r>
+            <w:r>
+              <w:rPr>
+                <w:noProof/>
+                <w:webHidden/>
+              </w:rPr>
+              <w:tab/>
+            </w:r>
+            <w:r>
+              <w:rPr>
+                <w:noProof/>
+                <w:webHidden/>
+              </w:rPr>
+              <w:fldChar w:fldCharType="begin"/>
+            </w:r>
+            <w:r>
+              <w:rPr>
+                <w:noProof/>
+                <w:webHidden/>
+              </w:rPr>
+              <w:instrText xml:space="preserve"> PAGEREF _Toc231069592 \h </w:instrText>
+            </w:r>
+            <w:r>
+              <w:rPr>
+                <w:noProof/>
+                <w:webHidden/>
+              </w:rPr>
+            </w:r>
+            <w:r>
+              <w:rPr>
+                <w:noProof/>
+                <w:webHidden/>
+              </w:rPr>
+              <w:fldChar w:fldCharType="separate"/>
+            </w:r>
+            <w:r>
+              <w:rPr>
+                <w:noProof/>
+                <w:webHidden/>
+              </w:rPr>
               <w:t>5</w:t>
+            </w:r>
+            <w:r>
+              <w:rPr>
+                <w:noProof/>
+                <w:webHidden/>
+              </w:rPr>
+              <w:fldChar w:fldCharType="end"/>
+            </w:r>
+          </w:hyperlink>
+        </w:p>
+        <w:p>
+          <w:pPr>
+            <w:pStyle w:val="TDC1"/>
+            <w:tabs>
+              <w:tab w:val="left" w:pos="720"/>
+              <w:tab w:val="right" w:leader="dot" w:pos="8828"/>
+            </w:tabs>
+            <w:rPr>
+              <w:rFonts w:eastAsiaTheme="minorEastAsia"/>
+              <w:noProof/>
+              <w:kern w:val="2"/>
+              <w:sz w:val="24"/>
+              <w:szCs w:val="24"/>
+              <w:lang w:val="es-EC" w:eastAsia="es-EC"/>
+              <w14:ligatures w14:val="standardContextual"/>
+            </w:rPr>
+          </w:pPr>
+          <w:hyperlink w:anchor="_Toc231069593" w:history="1">
+            <w:r>
+              <w:rPr>
+                <w:rStyle w:val="Hipervnculo"/>
+                <w:rFonts w:ascii="Arial" w:hAnsi="Arial" w:cs="Arial"/>
+                <w:noProof/>
+              </w:rPr>
+              <w:t>2.4.</w:t>
+            </w:r>
+            <w:r>
+              <w:rPr>
+                <w:rFonts w:eastAsiaTheme="minorEastAsia"/>
+                <w:noProof/>
+                <w:kern w:val="2"/>
+                <w:sz w:val="24"/>
+                <w:szCs w:val="24"/>
+                <w:lang w:val="es-EC" w:eastAsia="es-EC"/>
+                <w14:ligatures w14:val="standardContextual"/>
+              </w:rPr>
+              <w:tab/>
+            </w:r>
+            <w:r>
+              <w:rPr>
+                <w:rStyle w:val="Hipervnculo"/>
+                <w:rFonts w:ascii="Arial" w:hAnsi="Arial" w:cs="Arial"/>
+                <w:noProof/>
+              </w:rPr>
+              <w:t>Historias de usuario / Casos de Uso</w:t>
+            </w:r>
+            <w:r>
+              <w:rPr>
+                <w:noProof/>
+                <w:webHidden/>
+              </w:rPr>
+              <w:tab/>
+            </w:r>
+            <w:r>
+              <w:rPr>
+                <w:noProof/>
+                <w:webHidden/>
+              </w:rPr>
+              <w:fldChar w:fldCharType="begin"/>
+            </w:r>
+            <w:r>
+              <w:rPr>
+                <w:noProof/>
+                <w:webHidden/>
+              </w:rPr>
+              <w:instrText xml:space="preserve"> PAGEREF _Toc231069593 \h </w:instrText>
+            </w:r>
+            <w:r>
+              <w:rPr>
+                <w:noProof/>
+                <w:webHidden/>
+              </w:rPr>
+            </w:r>
+            <w:r>
+              <w:rPr>
+                <w:noProof/>
+                <w:webHidden/>
+              </w:rPr>
+              <w:fldChar w:fldCharType="separate"/>
+            </w:r>
+            <w:r>
+              <w:rPr>
+                <w:noProof/>
+                <w:webHidden/>
+              </w:rPr>
+              <w:t>5</w:t>
+            </w:r>
+            <w:r>
+              <w:rPr>
+                <w:noProof/>
+                <w:webHidden/>
+              </w:rPr>
+              <w:fldChar w:fldCharType="end"/>
+            </w:r>
+          </w:hyperlink>
+        </w:p>
+        <w:p>
+          <w:pPr>
+            <w:pStyle w:val="TDC1"/>
+            <w:tabs>
+              <w:tab w:val="left" w:pos="720"/>
+              <w:tab w:val="right" w:leader="dot" w:pos="8828"/>
+            </w:tabs>
+            <w:rPr>
+              <w:rFonts w:eastAsiaTheme="minorEastAsia"/>
+              <w:noProof/>
+              <w:kern w:val="2"/>
+              <w:sz w:val="24"/>
+              <w:szCs w:val="24"/>
+              <w:lang w:val="es-EC" w:eastAsia="es-EC"/>
+              <w14:ligatures w14:val="standardContextual"/>
+            </w:rPr>
+          </w:pPr>
+          <w:hyperlink w:anchor="_Toc231069594" w:history="1">
+            <w:r>
+              <w:rPr>
+                <w:rStyle w:val="Hipervnculo"/>
+                <w:rFonts w:ascii="Arial" w:hAnsi="Arial" w:cs="Arial"/>
+                <w:noProof/>
+              </w:rPr>
+              <w:t>2.5.</w:t>
+            </w:r>
+            <w:r>
+              <w:rPr>
+                <w:rFonts w:eastAsiaTheme="minorEastAsia"/>
+                <w:noProof/>
+                <w:kern w:val="2"/>
+                <w:sz w:val="24"/>
+                <w:szCs w:val="24"/>
+                <w:lang w:val="es-EC" w:eastAsia="es-EC"/>
+                <w14:ligatures w14:val="standardContextual"/>
+              </w:rPr>
+              <w:tab/>
+            </w:r>
+            <w:r>
+              <w:rPr>
+                <w:rStyle w:val="Hipervnculo"/>
+                <w:rFonts w:ascii="Arial" w:hAnsi="Arial" w:cs="Arial"/>
+                <w:noProof/>
+              </w:rPr>
+              <w:t>Sprint</w:t>
+            </w:r>
+            <w:r>
+              <w:rPr>
+                <w:noProof/>
+                <w:webHidden/>
+              </w:rPr>
+              <w:tab/>
+            </w:r>
+            <w:r>
+              <w:rPr>
+                <w:noProof/>
+                <w:webHidden/>
+              </w:rPr>
+              <w:fldChar w:fldCharType="begin"/>
+            </w:r>
+            <w:r>
+              <w:rPr>
+                <w:noProof/>
+                <w:webHidden/>
+              </w:rPr>
+              <w:instrText xml:space="preserve"> PAGEREF _Toc231069594 \h </w:instrText>
+            </w:r>
+            <w:r>
+              <w:rPr>
+                <w:noProof/>
+                <w:webHidden/>
+              </w:rPr>
+            </w:r>
+            <w:r>
+              <w:rPr>
+                <w:noProof/>
+                <w:webHidden/>
+              </w:rPr>
+              <w:fldChar w:fldCharType="separate"/>
+            </w:r>
+            <w:r>
+              <w:rPr>
+                <w:noProof/>
+                <w:webHidden/>
+              </w:rPr>
+              <w:t>6</w:t>
+            </w:r>
+            <w:r>
+              <w:rPr>
+                <w:noProof/>
+                <w:webHidden/>
+              </w:rPr>
+              <w:fldChar w:fldCharType="end"/>
+            </w:r>
+          </w:hyperlink>
+        </w:p>
+        <w:p>
+          <w:pPr>
+            <w:pStyle w:val="TDC1"/>
+            <w:tabs>
+              <w:tab w:val="left" w:pos="720"/>
+              <w:tab w:val="right" w:leader="dot" w:pos="8828"/>
+            </w:tabs>
+            <w:rPr>
+              <w:rFonts w:eastAsiaTheme="minorEastAsia"/>
+              <w:noProof/>
+              <w:kern w:val="2"/>
+              <w:sz w:val="24"/>
+              <w:szCs w:val="24"/>
+              <w:lang w:val="es-EC" w:eastAsia="es-EC"/>
+              <w14:ligatures w14:val="standardContextual"/>
+            </w:rPr>
+          </w:pPr>
+          <w:hyperlink w:anchor="_Toc231069595" w:history="1">
+            <w:r>
+              <w:rPr>
+                <w:rStyle w:val="Hipervnculo"/>
+                <w:rFonts w:ascii="Arial" w:hAnsi="Arial" w:cs="Arial"/>
+                <w:noProof/>
+              </w:rPr>
+              <w:t>2.6.</w:t>
+            </w:r>
+            <w:r>
+              <w:rPr>
+                <w:rFonts w:eastAsiaTheme="minorEastAsia"/>
+                <w:noProof/>
+                <w:kern w:val="2"/>
+                <w:sz w:val="24"/>
+                <w:szCs w:val="24"/>
+                <w:lang w:val="es-EC" w:eastAsia="es-EC"/>
+                <w14:ligatures w14:val="standardContextual"/>
+              </w:rPr>
+              <w:tab/>
+            </w:r>
+            <w:r>
+              <w:rPr>
+                <w:rStyle w:val="Hipervnculo"/>
+                <w:rFonts w:ascii="Arial" w:hAnsi="Arial" w:cs="Arial"/>
+                <w:noProof/>
+              </w:rPr>
+              <w:t>Diagramas: Clases y BD (diseño lógico) - Preguntas y respuesta al diagrama</w:t>
+            </w:r>
+            <w:r>
+              <w:rPr>
+                <w:noProof/>
+                <w:webHidden/>
+              </w:rPr>
+              <w:tab/>
+            </w:r>
+            <w:r>
+              <w:rPr>
+                <w:noProof/>
+                <w:webHidden/>
+              </w:rPr>
+              <w:fldChar w:fldCharType="begin"/>
+            </w:r>
+            <w:r>
+              <w:rPr>
+                <w:noProof/>
+                <w:webHidden/>
+              </w:rPr>
+              <w:instrText xml:space="preserve"> PAGEREF _Toc231069595 \h </w:instrText>
+            </w:r>
+            <w:r>
+              <w:rPr>
+                <w:noProof/>
+                <w:webHidden/>
+              </w:rPr>
+            </w:r>
+            <w:r>
+              <w:rPr>
+                <w:noProof/>
+                <w:webHidden/>
+              </w:rPr>
+              <w:fldChar w:fldCharType="separate"/>
+            </w:r>
+            <w:r>
+              <w:rPr>
+                <w:noProof/>
+                <w:webHidden/>
+              </w:rPr>
+              <w:t>6</w:t>
+            </w:r>
+            <w:r>
+              <w:rPr>
+                <w:noProof/>
+                <w:webHidden/>
+              </w:rPr>
+              <w:fldChar w:fldCharType="end"/>
+            </w:r>
+          </w:hyperlink>
+        </w:p>
+        <w:p>
+          <w:pPr>
+            <w:pStyle w:val="TDC1"/>
+            <w:tabs>
+              <w:tab w:val="left" w:pos="720"/>
+              <w:tab w:val="right" w:leader="dot" w:pos="8828"/>
+            </w:tabs>
+            <w:rPr>
+              <w:rFonts w:eastAsiaTheme="minorEastAsia"/>
+              <w:noProof/>
+              <w:kern w:val="2"/>
+              <w:sz w:val="24"/>
+              <w:szCs w:val="24"/>
+              <w:lang w:val="es-EC" w:eastAsia="es-EC"/>
+              <w14:ligatures w14:val="standardContextual"/>
+            </w:rPr>
+          </w:pPr>
+          <w:hyperlink w:anchor="_Toc231069596" w:history="1">
+            <w:r>
+              <w:rPr>
+                <w:rStyle w:val="Hipervnculo"/>
+                <w:rFonts w:ascii="Arial" w:hAnsi="Arial" w:cs="Arial"/>
+                <w:noProof/>
+              </w:rPr>
+              <w:t>2.7.</w:t>
+            </w:r>
+            <w:r>
+              <w:rPr>
+                <w:rFonts w:eastAsiaTheme="minorEastAsia"/>
+                <w:noProof/>
+                <w:kern w:val="2"/>
+                <w:sz w:val="24"/>
+                <w:szCs w:val="24"/>
+                <w:lang w:val="es-EC" w:eastAsia="es-EC"/>
+                <w14:ligatures w14:val="standardContextual"/>
+              </w:rPr>
+              <w:tab/>
+            </w:r>
+            <w:r>
+              <w:rPr>
+                <w:rStyle w:val="Hipervnculo"/>
+                <w:rFonts w:ascii="Arial" w:hAnsi="Arial" w:cs="Arial"/>
+                <w:noProof/>
+              </w:rPr>
+              <w:t>Diagrama de componentes</w:t>
+            </w:r>
+            <w:r>
+              <w:rPr>
+                <w:noProof/>
+                <w:webHidden/>
+              </w:rPr>
+              <w:tab/>
+            </w:r>
+            <w:r>
+              <w:rPr>
+                <w:noProof/>
+                <w:webHidden/>
+              </w:rPr>
+              <w:fldChar w:fldCharType="begin"/>
+            </w:r>
+            <w:r>
+              <w:rPr>
+                <w:noProof/>
+                <w:webHidden/>
+              </w:rPr>
+              <w:instrText xml:space="preserve"> PAGEREF _Toc231069596 \h </w:instrText>
+            </w:r>
+            <w:r>
+              <w:rPr>
+                <w:noProof/>
+                <w:webHidden/>
+              </w:rPr>
+            </w:r>
+            <w:r>
+              <w:rPr>
+                <w:noProof/>
+                <w:webHidden/>
+              </w:rPr>
+              <w:fldChar w:fldCharType="separate"/>
+            </w:r>
+            <w:r>
+              <w:rPr>
+                <w:noProof/>
+                <w:webHidden/>
+              </w:rPr>
+              <w:t>7</w:t>
+            </w:r>
+            <w:r>
+              <w:rPr>
+                <w:noProof/>
+                <w:webHidden/>
+              </w:rPr>
+              <w:fldChar w:fldCharType="end"/>
+            </w:r>
+          </w:hyperlink>
+        </w:p>
+        <w:p>
+          <w:pPr>
+            <w:pStyle w:val="TDC1"/>
+            <w:tabs>
+              <w:tab w:val="left" w:pos="720"/>
+              <w:tab w:val="right" w:leader="dot" w:pos="8828"/>
+            </w:tabs>
+            <w:rPr>
+              <w:rFonts w:eastAsiaTheme="minorEastAsia"/>
+              <w:noProof/>
+              <w:kern w:val="2"/>
+              <w:sz w:val="24"/>
+              <w:szCs w:val="24"/>
+              <w:lang w:val="es-EC" w:eastAsia="es-EC"/>
+              <w14:ligatures w14:val="standardContextual"/>
+            </w:rPr>
+          </w:pPr>
+          <w:hyperlink w:anchor="_Toc231069597" w:history="1">
+            <w:r>
+              <w:rPr>
+                <w:rStyle w:val="Hipervnculo"/>
+                <w:rFonts w:ascii="Arial" w:hAnsi="Arial" w:cs="Arial"/>
+                <w:noProof/>
+              </w:rPr>
+              <w:t>2.8.</w:t>
+            </w:r>
+            <w:r>
+              <w:rPr>
+                <w:rFonts w:eastAsiaTheme="minorEastAsia"/>
+                <w:noProof/>
+                <w:kern w:val="2"/>
+                <w:sz w:val="24"/>
+                <w:szCs w:val="24"/>
+                <w:lang w:val="es-EC" w:eastAsia="es-EC"/>
+                <w14:ligatures w14:val="standardContextual"/>
+              </w:rPr>
+              <w:tab/>
+            </w:r>
+            <w:r>
+              <w:rPr>
+                <w:rStyle w:val="Hipervnculo"/>
+                <w:rFonts w:ascii="Arial" w:hAnsi="Arial" w:cs="Arial"/>
+                <w:noProof/>
+              </w:rPr>
+              <w:t>Arquitectura lógica y física (propuesta)</w:t>
+            </w:r>
+            <w:r>
+              <w:rPr>
+                <w:noProof/>
+                <w:webHidden/>
+              </w:rPr>
+              <w:tab/>
+            </w:r>
+            <w:r>
+              <w:rPr>
+                <w:noProof/>
+                <w:webHidden/>
+              </w:rPr>
+              <w:fldChar w:fldCharType="begin"/>
+            </w:r>
+            <w:r>
+              <w:rPr>
+                <w:noProof/>
+                <w:webHidden/>
+              </w:rPr>
+              <w:instrText xml:space="preserve"> PAGEREF _Toc231069597 \h </w:instrText>
+            </w:r>
+            <w:r>
+              <w:rPr>
+                <w:noProof/>
+                <w:webHidden/>
+              </w:rPr>
+            </w:r>
+            <w:r>
+              <w:rPr>
+                <w:noProof/>
+                <w:webHidden/>
+              </w:rPr>
+              <w:fldChar w:fldCharType="separate"/>
+            </w:r>
+            <w:r>
+              <w:rPr>
+                <w:noProof/>
+                <w:webHidden/>
+              </w:rPr>
+              <w:t>8</w:t>
+            </w:r>
+            <w:r>
+              <w:rPr>
+                <w:noProof/>
+                <w:webHidden/>
+              </w:rPr>
+              <w:fldChar w:fldCharType="end"/>
+            </w:r>
+          </w:hyperlink>
+        </w:p>
+        <w:p>
+          <w:pPr>
+            <w:pStyle w:val="TDC1"/>
+            <w:tabs>
+              <w:tab w:val="left" w:pos="720"/>
+              <w:tab w:val="right" w:leader="dot" w:pos="8828"/>
+            </w:tabs>
+            <w:rPr>
+              <w:rFonts w:eastAsiaTheme="minorEastAsia"/>
+              <w:noProof/>
+              <w:kern w:val="2"/>
+              <w:sz w:val="24"/>
+              <w:szCs w:val="24"/>
+              <w:lang w:val="es-EC" w:eastAsia="es-EC"/>
+              <w14:ligatures w14:val="standardContextual"/>
+            </w:rPr>
+          </w:pPr>
+          <w:hyperlink w:anchor="_Toc231069598" w:history="1">
+            <w:r>
+              <w:rPr>
+                <w:rStyle w:val="Hipervnculo"/>
+                <w:rFonts w:ascii="Arial" w:hAnsi="Arial" w:cs="Arial"/>
+                <w:noProof/>
+              </w:rPr>
+              <w:t>2.9.</w:t>
+            </w:r>
+            <w:r>
+              <w:rPr>
+                <w:rFonts w:eastAsiaTheme="minorEastAsia"/>
+                <w:noProof/>
+                <w:kern w:val="2"/>
+                <w:sz w:val="24"/>
+                <w:szCs w:val="24"/>
+                <w:lang w:val="es-EC" w:eastAsia="es-EC"/>
+                <w14:ligatures w14:val="standardContextual"/>
+              </w:rPr>
+              <w:tab/>
+            </w:r>
+            <w:r>
+              <w:rPr>
+                <w:rStyle w:val="Hipervnculo"/>
+                <w:rFonts w:ascii="Arial" w:hAnsi="Arial" w:cs="Arial"/>
+                <w:noProof/>
+              </w:rPr>
+              <w:t>Prototipo de pantallas no funcional</w:t>
+            </w:r>
+            <w:r>
+              <w:rPr>
+                <w:noProof/>
+                <w:webHidden/>
+              </w:rPr>
+              <w:tab/>
+            </w:r>
+            <w:r>
+              <w:rPr>
+                <w:noProof/>
+                <w:webHidden/>
+              </w:rPr>
+              <w:fldChar w:fldCharType="begin"/>
+            </w:r>
+            <w:r>
+              <w:rPr>
+                <w:noProof/>
+                <w:webHidden/>
+              </w:rPr>
+              <w:instrText xml:space="preserve"> PAGEREF _Toc231069598 \h </w:instrText>
+            </w:r>
+            <w:r>
+              <w:rPr>
+                <w:noProof/>
+                <w:webHidden/>
+              </w:rPr>
+            </w:r>
+            <w:r>
+              <w:rPr>
+                <w:noProof/>
+                <w:webHidden/>
+              </w:rPr>
+              <w:fldChar w:fldCharType="separate"/>
+            </w:r>
+            <w:r>
+              <w:rPr>
+                <w:noProof/>
+                <w:webHidden/>
+              </w:rPr>
+              <w:t>9</w:t>
             </w:r>
             <w:r>
               <w:rPr>
@@ -1043,6 +1994,7 @@
           <w:szCs w:val="32"/>
         </w:rPr>
       </w:pPr>
+      <w:bookmarkStart w:id="0" w:name="_Toc231069585"/>
       <w:r>
         <w:rPr>
           <w:rFonts w:ascii="Arial" w:eastAsia="Arial" w:hAnsi="Arial" w:cs="Arial"/>
@@ -1052,6 +2004,7 @@
         <w:lastRenderedPageBreak/>
         <w:t>Capítulo 1: Generalidades del Proyecto</w:t>
       </w:r>
+      <w:bookmarkEnd w:id="0"/>
     </w:p>
     <w:p>
       <w:pPr>
@@ -1067,6 +2020,7 @@
           <w:szCs w:val="22"/>
         </w:rPr>
       </w:pPr>
+      <w:bookmarkStart w:id="1" w:name="_Toc231069586"/>
       <w:r>
         <w:rPr>
           <w:rFonts w:ascii="Arial" w:hAnsi="Arial" w:cs="Arial"/>
@@ -1075,6 +2029,7 @@
         </w:rPr>
         <w:t>Introducción</w:t>
       </w:r>
+      <w:bookmarkEnd w:id="1"/>
     </w:p>
     <w:p>
       <w:pPr>
@@ -1089,7 +2044,21 @@
         <w:rPr>
           <w:rFonts w:ascii="Arial" w:eastAsia="Arial" w:hAnsi="Arial" w:cs="Arial"/>
         </w:rPr>
-        <w:t xml:space="preserve">El presente documento detalla el análisis y planificación para el desarrollo de una plataforma web de gestión de pedidos orientada a la comercialización de productos e insumos para micromercados. El sistema actúa como un puente tecnológico entre empresas mayoristas y tiendas locales (principalmente en zonas rurales), </w:t>
+        <w:t xml:space="preserve">El presente documento detalla el análisis y planificación para el desarrollo de una plataforma web de gestión de pedidos orientada a la comercialización de productos e insumos para </w:t>
+      </w:r>
+      <w:proofErr w:type="spellStart"/>
+      <w:r>
+        <w:rPr>
+          <w:rFonts w:ascii="Arial" w:eastAsia="Arial" w:hAnsi="Arial" w:cs="Arial"/>
+        </w:rPr>
+        <w:t>micromercados</w:t>
+      </w:r>
+      <w:proofErr w:type="spellEnd"/>
+      <w:r>
+        <w:rPr>
+          <w:rFonts w:ascii="Arial" w:eastAsia="Arial" w:hAnsi="Arial" w:cs="Arial"/>
+        </w:rPr>
+        <w:t xml:space="preserve">. El sistema actúa como un puente tecnológico entre empresas mayoristas y tiendas locales (principalmente en zonas rurales), </w:t>
       </w:r>
       <w:r>
         <w:rPr>
@@ -1101,7 +2070,49 @@
         <w:rPr>
           <w:rFonts w:ascii="Arial" w:eastAsia="Arial" w:hAnsi="Arial" w:cs="Arial"/>
         </w:rPr>
-        <w:t xml:space="preserve"> a vendedores independientes mediante un catálogo con inventario en tiempo real, incentivos por gamificación y un stack tecnológico moderno basado en Angular para el frontend y Django con PostgreSQL para el backend.</w:t>
+        <w:t xml:space="preserve"> a vendedores independientes mediante un catálogo con inventario en tiempo real, incentivos por gamificación y un </w:t>
+      </w:r>
+      <w:proofErr w:type="spellStart"/>
+      <w:r>
+        <w:rPr>
+          <w:rFonts w:ascii="Arial" w:eastAsia="Arial" w:hAnsi="Arial" w:cs="Arial"/>
+        </w:rPr>
+        <w:t>stack</w:t>
+      </w:r>
+      <w:proofErr w:type="spellEnd"/>
+      <w:r>
+        <w:rPr>
+          <w:rFonts w:ascii="Arial" w:eastAsia="Arial" w:hAnsi="Arial" w:cs="Arial"/>
+        </w:rPr>
+        <w:t xml:space="preserve"> tecnológico moderno basado en Angular para el </w:t>
+      </w:r>
+      <w:proofErr w:type="spellStart"/>
+      <w:r>
+        <w:rPr>
+          <w:rFonts w:ascii="Arial" w:eastAsia="Arial" w:hAnsi="Arial" w:cs="Arial"/>
+        </w:rPr>
+        <w:t>frontend</w:t>
+      </w:r>
+      <w:proofErr w:type="spellEnd"/>
+      <w:r>
+        <w:rPr>
+          <w:rFonts w:ascii="Arial" w:eastAsia="Arial" w:hAnsi="Arial" w:cs="Arial"/>
+        </w:rPr>
+        <w:t xml:space="preserve"> y Django con PostgreSQL para el </w:t>
+      </w:r>
+      <w:proofErr w:type="spellStart"/>
+      <w:r>
+        <w:rPr>
+          <w:rFonts w:ascii="Arial" w:eastAsia="Arial" w:hAnsi="Arial" w:cs="Arial"/>
+        </w:rPr>
+        <w:t>backend</w:t>
+      </w:r>
+      <w:proofErr w:type="spellEnd"/>
+      <w:r>
+        <w:rPr>
+          <w:rFonts w:ascii="Arial" w:eastAsia="Arial" w:hAnsi="Arial" w:cs="Arial"/>
+        </w:rPr>
+        <w:t>.</w:t>
       </w:r>
     </w:p>
     <w:p>
@@ -1118,6 +2129,7 @@
           <w:szCs w:val="28"/>
         </w:rPr>
       </w:pPr>
+      <w:bookmarkStart w:id="2" w:name="_Toc231069587"/>
       <w:r>
         <w:rPr>
           <w:rFonts w:ascii="Arial" w:hAnsi="Arial" w:cs="Arial"/>
@@ -1126,6 +2138,7 @@
         </w:rPr>
         <w:t>Problemática</w:t>
       </w:r>
+      <w:bookmarkEnd w:id="2"/>
     </w:p>
     <w:p>
       <w:pPr>
@@ -1140,7 +2153,35 @@
         <w:rPr>
           <w:rFonts w:ascii="Arial" w:eastAsia="Arial" w:hAnsi="Arial" w:cs="Arial"/>
         </w:rPr>
-        <w:t xml:space="preserve">Las empresas mayoristas y proveedores de micromercados en zonas rurales enfrentan una pérdida constante de ventas y clientes debido a un control deficiente y desfasado del inventario entre el punto de abastecimiento y la toma de pedidos en campo. Simultáneamente, la adopción de soluciones de compra directa (e-commerce) es inviable debido a la barrera tecnológica y desconfianza de los dueños de tiendas (población mayor a 60 años). Esto hace indispensable la figura de vendedores intermediarios, </w:t>
+        <w:t xml:space="preserve">Las empresas mayoristas y proveedores de </w:t>
+      </w:r>
+      <w:proofErr w:type="spellStart"/>
+      <w:r>
+        <w:rPr>
+          <w:rFonts w:ascii="Arial" w:eastAsia="Arial" w:hAnsi="Arial" w:cs="Arial"/>
+        </w:rPr>
+        <w:t>micromercados</w:t>
+      </w:r>
+      <w:proofErr w:type="spellEnd"/>
+      <w:r>
+        <w:rPr>
+          <w:rFonts w:ascii="Arial" w:eastAsia="Arial" w:hAnsi="Arial" w:cs="Arial"/>
+        </w:rPr>
+        <w:t xml:space="preserve"> en zonas rurales enfrentan una pérdida constante de ventas y clientes debido a un control deficiente y desfasado del inventario entre el punto de abastecimiento y la toma de pedidos en campo. Simultáneamente, la adopción de soluciones de compra directa (e-</w:t>
+      </w:r>
+      <w:proofErr w:type="spellStart"/>
+      <w:r>
+        <w:rPr>
+          <w:rFonts w:ascii="Arial" w:eastAsia="Arial" w:hAnsi="Arial" w:cs="Arial"/>
+        </w:rPr>
+        <w:t>commerce</w:t>
+      </w:r>
+      <w:proofErr w:type="spellEnd"/>
+      <w:r>
+        <w:rPr>
+          <w:rFonts w:ascii="Arial" w:eastAsia="Arial" w:hAnsi="Arial" w:cs="Arial"/>
+        </w:rPr>
+        <w:t xml:space="preserve">) es inviable debido a la barrera tecnológica y desconfianza de los dueños de tiendas (población mayor a 60 años). Esto hace indispensable la figura de vendedores intermediarios, </w:t>
       </w:r>
       <w:r>
         <w:rPr>
@@ -1169,6 +2210,7 @@
           <w:szCs w:val="28"/>
         </w:rPr>
       </w:pPr>
+      <w:bookmarkStart w:id="3" w:name="_Toc231069588"/>
       <w:r>
         <w:rPr>
           <w:rFonts w:ascii="Arial" w:hAnsi="Arial" w:cs="Arial"/>
@@ -1177,6 +2219,7 @@
         </w:rPr>
         <w:t>Metodología o estrategia de desarrollo</w:t>
       </w:r>
+      <w:bookmarkEnd w:id="3"/>
     </w:p>
     <w:p>
       <w:pPr>
@@ -1198,7 +2241,21 @@
           <w:rFonts w:ascii="Arial" w:eastAsia="Arial" w:hAnsi="Arial" w:cs="Arial"/>
         </w:rPr>
         <w:lastRenderedPageBreak/>
-        <w:t>funcionales en ciclos cortos. La comunicación del equipo se gestionará mediante juntas de planificación de sprint, organizaciones diarias de sincronización (daily stand-ups) y juntas de revisión al finalizar cada iteración. Se utilizarán herramientas de control de versiones (Git) para el seguimiento de las tareas.</w:t>
+        <w:t>funcionales en ciclos cortos. La comunicación del equipo se gestionará mediante juntas de planificación de sprint, organizaciones diarias de sincronización (</w:t>
+      </w:r>
+      <w:proofErr w:type="spellStart"/>
+      <w:r>
+        <w:rPr>
+          <w:rFonts w:ascii="Arial" w:eastAsia="Arial" w:hAnsi="Arial" w:cs="Arial"/>
+        </w:rPr>
+        <w:t>daily</w:t>
+      </w:r>
+      <w:proofErr w:type="spellEnd"/>
+      <w:r>
+        <w:rPr>
+          <w:rFonts w:ascii="Arial" w:eastAsia="Arial" w:hAnsi="Arial" w:cs="Arial"/>
+        </w:rPr>
+        <w:t xml:space="preserve"> stand-ups) y juntas de revisión al finalizar cada iteración. Se utilizarán herramientas de control de versiones (Git) para el seguimiento de las tareas.</w:t>
       </w:r>
     </w:p>
     <w:p>
@@ -1214,6 +2271,7 @@
           <w:szCs w:val="32"/>
         </w:rPr>
       </w:pPr>
+      <w:bookmarkStart w:id="4" w:name="_Toc231069589"/>
       <w:r>
         <w:rPr>
           <w:rFonts w:ascii="Arial" w:eastAsia="Arial" w:hAnsi="Arial" w:cs="Arial"/>
@@ -1222,6 +2280,7 @@
         </w:rPr>
         <w:t>Capítulo 2: Planificación y Análisis</w:t>
       </w:r>
+      <w:bookmarkEnd w:id="4"/>
     </w:p>
     <w:p>
       <w:pPr>
@@ -1237,6 +2296,7 @@
           <w:szCs w:val="28"/>
         </w:rPr>
       </w:pPr>
+      <w:bookmarkStart w:id="5" w:name="_Toc231069590"/>
       <w:r>
         <w:rPr>
           <w:rFonts w:ascii="Arial" w:hAnsi="Arial" w:cs="Arial"/>
@@ -1245,6 +2305,7 @@
         </w:rPr>
         <w:t>Análisis</w:t>
       </w:r>
+      <w:bookmarkEnd w:id="5"/>
     </w:p>
     <w:p>
       <w:pPr>
@@ -1259,7 +2320,21 @@
         <w:rPr>
           <w:rFonts w:ascii="Arial" w:eastAsia="Arial" w:hAnsi="Arial" w:cs="Arial"/>
         </w:rPr>
-        <w:t>El proyecto se enfoca en resolver la brecha de información entre el inventario de la comercializadora y el vendedor en campo. Los interesados principales incluyen a las Comercializadoras (quienes pagan la suscripción y proveen el inventario mediante integraciones API), los Vendedores (usuarios de la PWA que registran pedidos y ganan comisiones/puntos), y los dueños de Micromercados (beneficiarios indirectos). El alcance se limita a la intermediación y toma de pedidos, dejando fuera la logística de entrega física.</w:t>
+        <w:t xml:space="preserve">El proyecto se enfoca en resolver la brecha de información entre el inventario de la comercializadora y el vendedor en campo. Los interesados principales incluyen a las Comercializadoras (quienes pagan la suscripción y proveen el inventario mediante integraciones API), los Vendedores (usuarios de la PWA que registran pedidos y ganan comisiones/puntos), y los dueños de </w:t>
+      </w:r>
+      <w:proofErr w:type="spellStart"/>
+      <w:r>
+        <w:rPr>
+          <w:rFonts w:ascii="Arial" w:eastAsia="Arial" w:hAnsi="Arial" w:cs="Arial"/>
+        </w:rPr>
+        <w:t>Micromercados</w:t>
+      </w:r>
+      <w:proofErr w:type="spellEnd"/>
+      <w:r>
+        <w:rPr>
+          <w:rFonts w:ascii="Arial" w:eastAsia="Arial" w:hAnsi="Arial" w:cs="Arial"/>
+        </w:rPr>
+        <w:t xml:space="preserve"> (beneficiarios indirectos). El alcance se limita a la intermediación y toma de pedidos, dejando fuera la logística de entrega física.</w:t>
       </w:r>
     </w:p>
     <w:p>
@@ -1276,6 +2351,7 @@
           <w:szCs w:val="28"/>
         </w:rPr>
       </w:pPr>
+      <w:bookmarkStart w:id="6" w:name="_Toc231069591"/>
       <w:r>
         <w:rPr>
           <w:rFonts w:ascii="Arial" w:hAnsi="Arial" w:cs="Arial"/>
@@ -1284,6 +2360,7 @@
         </w:rPr>
         <w:t>Requisitos funcionales</w:t>
       </w:r>
+      <w:bookmarkEnd w:id="6"/>
     </w:p>
     <w:tbl>
       <w:tblPr>
@@ -1732,6 +2809,7 @@
           <w:szCs w:val="28"/>
         </w:rPr>
       </w:pPr>
+      <w:bookmarkStart w:id="7" w:name="_Toc231069592"/>
       <w:r>
         <w:rPr>
           <w:rFonts w:ascii="Arial" w:hAnsi="Arial" w:cs="Arial"/>
@@ -1740,6 +2818,7 @@
         </w:rPr>
         <w:t>Requisitos no funcionales</w:t>
       </w:r>
+      <w:bookmarkEnd w:id="7"/>
     </w:p>
     <w:tbl>
       <w:tblPr>
@@ -1940,7 +3019,39 @@
                 <w:rFonts w:ascii="Arial" w:eastAsia="Arial" w:hAnsi="Arial" w:cs="Arial"/>
                 <w:lang w:val="es-EC" w:eastAsia="es-EC"/>
               </w:rPr>
-              <w:t xml:space="preserve"> El backend debe estar desarrollado en Django (Python) y el frontend en Angular.</w:t>
+              <w:t xml:space="preserve"> El </w:t>
+            </w:r>
+            <w:proofErr w:type="spellStart"/>
+            <w:r>
+              <w:rPr>
+                <w:rFonts w:ascii="Arial" w:eastAsia="Arial" w:hAnsi="Arial" w:cs="Arial"/>
+                <w:lang w:val="es-EC" w:eastAsia="es-EC"/>
+              </w:rPr>
+              <w:t>backend</w:t>
+            </w:r>
+            <w:proofErr w:type="spellEnd"/>
+            <w:r>
+              <w:rPr>
+                <w:rFonts w:ascii="Arial" w:eastAsia="Arial" w:hAnsi="Arial" w:cs="Arial"/>
+                <w:lang w:val="es-EC" w:eastAsia="es-EC"/>
+              </w:rPr>
+              <w:t xml:space="preserve"> debe estar desarrollado en Django (Python) y el </w:t>
+            </w:r>
+            <w:proofErr w:type="spellStart"/>
+            <w:r>
+              <w:rPr>
+                <w:rFonts w:ascii="Arial" w:eastAsia="Arial" w:hAnsi="Arial" w:cs="Arial"/>
+                <w:lang w:val="es-EC" w:eastAsia="es-EC"/>
+              </w:rPr>
+              <w:t>frontend</w:t>
+            </w:r>
+            <w:proofErr w:type="spellEnd"/>
+            <w:r>
+              <w:rPr>
+                <w:rFonts w:ascii="Arial" w:eastAsia="Arial" w:hAnsi="Arial" w:cs="Arial"/>
+                <w:lang w:val="es-EC" w:eastAsia="es-EC"/>
+              </w:rPr>
+              <w:t xml:space="preserve"> en Angular.</w:t>
             </w:r>
           </w:p>
         </w:tc>
@@ -2130,6 +3241,7 @@
           <w:szCs w:val="28"/>
         </w:rPr>
       </w:pPr>
+      <w:bookmarkStart w:id="8" w:name="_Toc231069593"/>
       <w:r>
         <w:rPr>
           <w:rFonts w:ascii="Arial" w:hAnsi="Arial" w:cs="Arial"/>
@@ -2138,6 +3250,7 @@
         </w:rPr>
         <w:t>Historias de usuario / Casos de Uso</w:t>
       </w:r>
+      <w:bookmarkEnd w:id="8"/>
     </w:p>
     <w:p>
       <w:pPr>
@@ -2185,7 +3298,21 @@
           <w:rFonts w:ascii="Arial" w:eastAsia="Arial" w:hAnsi="Arial" w:cs="Arial"/>
         </w:rPr>
         <w:lastRenderedPageBreak/>
-        <w:t>HU-03 (Vendedor): Como vendedor, quiero visualizar mis puntos acumulados en un dashboard para canjearlos y monitorear mis ganancias por comisiones.</w:t>
+        <w:t xml:space="preserve">HU-03 (Vendedor): Como vendedor, quiero visualizar mis puntos acumulados en un </w:t>
+      </w:r>
+      <w:proofErr w:type="spellStart"/>
+      <w:r>
+        <w:rPr>
+          <w:rFonts w:ascii="Arial" w:eastAsia="Arial" w:hAnsi="Arial" w:cs="Arial"/>
+        </w:rPr>
+        <w:t>dashboard</w:t>
+      </w:r>
+      <w:proofErr w:type="spellEnd"/>
+      <w:r>
+        <w:rPr>
+          <w:rFonts w:ascii="Arial" w:eastAsia="Arial" w:hAnsi="Arial" w:cs="Arial"/>
+        </w:rPr>
+        <w:t xml:space="preserve"> para canjearlos y monitorear mis ganancias por comisiones.</w:t>
       </w:r>
     </w:p>
     <w:p>
@@ -2202,6 +3329,7 @@
           <w:szCs w:val="28"/>
         </w:rPr>
       </w:pPr>
+      <w:bookmarkStart w:id="9" w:name="_Toc231069594"/>
       <w:r>
         <w:rPr>
           <w:rFonts w:ascii="Arial" w:hAnsi="Arial" w:cs="Arial"/>
@@ -2210,6 +3338,7 @@
         </w:rPr>
         <w:t>Sprint</w:t>
       </w:r>
+      <w:bookmarkEnd w:id="9"/>
     </w:p>
     <w:p>
       <w:pPr>
@@ -2224,7 +3353,21 @@
         <w:rPr>
           <w:rFonts w:ascii="Arial" w:eastAsia="Arial" w:hAnsi="Arial" w:cs="Arial"/>
         </w:rPr>
-        <w:t>El desarrollo se dividirá en Sprints de 2 semanas:</w:t>
+        <w:t xml:space="preserve">El desarrollo se dividirá en </w:t>
+      </w:r>
+      <w:proofErr w:type="spellStart"/>
+      <w:r>
+        <w:rPr>
+          <w:rFonts w:ascii="Arial" w:eastAsia="Arial" w:hAnsi="Arial" w:cs="Arial"/>
+        </w:rPr>
+        <w:t>Sprints</w:t>
+      </w:r>
+      <w:proofErr w:type="spellEnd"/>
+      <w:r>
+        <w:rPr>
+          <w:rFonts w:ascii="Arial" w:eastAsia="Arial" w:hAnsi="Arial" w:cs="Arial"/>
+        </w:rPr>
+        <w:t xml:space="preserve"> de 2 semanas:</w:t>
       </w:r>
     </w:p>
     <w:p>
@@ -2280,7 +3423,21 @@
         <w:rPr>
           <w:rFonts w:ascii="Arial" w:eastAsia="Arial" w:hAnsi="Arial" w:cs="Arial"/>
         </w:rPr>
-        <w:t>Sprint 2: Desarrollo de los endpoints (API) de inventario y maquetación de la interfaz principal en Angular.</w:t>
+        <w:t xml:space="preserve">Sprint 2: Desarrollo de los </w:t>
+      </w:r>
+      <w:proofErr w:type="spellStart"/>
+      <w:r>
+        <w:rPr>
+          <w:rFonts w:ascii="Arial" w:eastAsia="Arial" w:hAnsi="Arial" w:cs="Arial"/>
+        </w:rPr>
+        <w:t>endpoints</w:t>
+      </w:r>
+      <w:proofErr w:type="spellEnd"/>
+      <w:r>
+        <w:rPr>
+          <w:rFonts w:ascii="Arial" w:eastAsia="Arial" w:hAnsi="Arial" w:cs="Arial"/>
+        </w:rPr>
+        <w:t xml:space="preserve"> (API) de inventario y maquetación de la interfaz principal en Angular.</w:t>
       </w:r>
     </w:p>
     <w:p>
@@ -2353,6 +3510,7 @@
           <w:szCs w:val="28"/>
         </w:rPr>
       </w:pPr>
+      <w:bookmarkStart w:id="10" w:name="_Toc231069595"/>
       <w:r>
         <w:rPr>
           <w:rFonts w:ascii="Arial" w:hAnsi="Arial" w:cs="Arial"/>
@@ -2361,6 +3519,7 @@
         </w:rPr>
         <w:t>Diagramas: Clases y BD (diseño lógico) - Preguntas y respuesta al diagrama</w:t>
       </w:r>
+      <w:bookmarkEnd w:id="10"/>
     </w:p>
     <w:p>
       <w:pPr>
@@ -2375,7 +3534,35 @@
         <w:rPr>
           <w:rFonts w:ascii="Arial" w:eastAsia="Arial" w:hAnsi="Arial" w:cs="Arial"/>
         </w:rPr>
-        <w:t>El diseño lógico en PostgreSQL contempla las siguientes entidades principales: Usuario, Vendedor, Comercializadora, Tienda, Producto, Inventario, Pedido, DetallePedido, y TransaccionPuntos. A continuación, se plantean preguntas críticas para validar la robustez del modelo de clases de cara a su implementación en Django:</w:t>
+        <w:t xml:space="preserve">El diseño lógico en PostgreSQL contempla las siguientes entidades principales: Usuario, Vendedor, Comercializadora, Tienda, Producto, Inventario, Pedido, </w:t>
+      </w:r>
+      <w:proofErr w:type="spellStart"/>
+      <w:r>
+        <w:rPr>
+          <w:rFonts w:ascii="Arial" w:eastAsia="Arial" w:hAnsi="Arial" w:cs="Arial"/>
+        </w:rPr>
+        <w:t>DetallePedido</w:t>
+      </w:r>
+      <w:proofErr w:type="spellEnd"/>
+      <w:r>
+        <w:rPr>
+          <w:rFonts w:ascii="Arial" w:eastAsia="Arial" w:hAnsi="Arial" w:cs="Arial"/>
+        </w:rPr>
+        <w:t xml:space="preserve">, y </w:t>
+      </w:r>
+      <w:proofErr w:type="spellStart"/>
+      <w:r>
+        <w:rPr>
+          <w:rFonts w:ascii="Arial" w:eastAsia="Arial" w:hAnsi="Arial" w:cs="Arial"/>
+        </w:rPr>
+        <w:t>TransaccionPuntos</w:t>
+      </w:r>
+      <w:proofErr w:type="spellEnd"/>
+      <w:r>
+        <w:rPr>
+          <w:rFonts w:ascii="Arial" w:eastAsia="Arial" w:hAnsi="Arial" w:cs="Arial"/>
+        </w:rPr>
+        <w:t>. A continuación, se plantean preguntas críticas para validar la robustez del modelo de clases de cara a su implementación en Django:</w:t>
       </w:r>
     </w:p>
     <w:p>
@@ -2418,7 +3605,63 @@
           <w:rFonts w:ascii="Arial" w:eastAsia="Arial" w:hAnsi="Arial" w:cs="Arial"/>
         </w:rPr>
         <w:lastRenderedPageBreak/>
-        <w:t>Respuesta: El modelo en Django debe implementar bloqueo optimista (Optimistic Locking) agregando un campo de version en la entidad Inventario. Antes de guardar el DetallePedido y descontar el stock, PostgreSQL verifica que la versión no haya cambiado; si cambió, se lanza una excepción y se notifica al vendedor que el stock acaba de agotarse.</w:t>
+        <w:t>Respuesta: El modelo en Django debe implementar bloqueo optimista (</w:t>
+      </w:r>
+      <w:proofErr w:type="spellStart"/>
+      <w:r>
+        <w:rPr>
+          <w:rFonts w:ascii="Arial" w:eastAsia="Arial" w:hAnsi="Arial" w:cs="Arial"/>
+        </w:rPr>
+        <w:t>Optimistic</w:t>
+      </w:r>
+      <w:proofErr w:type="spellEnd"/>
+      <w:r>
+        <w:rPr>
+          <w:rFonts w:ascii="Arial" w:eastAsia="Arial" w:hAnsi="Arial" w:cs="Arial"/>
+        </w:rPr>
+        <w:t xml:space="preserve"> </w:t>
+      </w:r>
+      <w:proofErr w:type="spellStart"/>
+      <w:r>
+        <w:rPr>
+          <w:rFonts w:ascii="Arial" w:eastAsia="Arial" w:hAnsi="Arial" w:cs="Arial"/>
+        </w:rPr>
+        <w:t>Locking</w:t>
+      </w:r>
+      <w:proofErr w:type="spellEnd"/>
+      <w:r>
+        <w:rPr>
+          <w:rFonts w:ascii="Arial" w:eastAsia="Arial" w:hAnsi="Arial" w:cs="Arial"/>
+        </w:rPr>
+        <w:t xml:space="preserve">) agregando un campo de </w:t>
+      </w:r>
+      <w:proofErr w:type="spellStart"/>
+      <w:r>
+        <w:rPr>
+          <w:rFonts w:ascii="Arial" w:eastAsia="Arial" w:hAnsi="Arial" w:cs="Arial"/>
+        </w:rPr>
+        <w:t>version</w:t>
+      </w:r>
+      <w:proofErr w:type="spellEnd"/>
+      <w:r>
+        <w:rPr>
+          <w:rFonts w:ascii="Arial" w:eastAsia="Arial" w:hAnsi="Arial" w:cs="Arial"/>
+        </w:rPr>
+        <w:t xml:space="preserve"> en la entidad Inventario. Antes de guardar el </w:t>
+      </w:r>
+      <w:proofErr w:type="spellStart"/>
+      <w:r>
+        <w:rPr>
+          <w:rFonts w:ascii="Arial" w:eastAsia="Arial" w:hAnsi="Arial" w:cs="Arial"/>
+        </w:rPr>
+        <w:t>DetallePedido</w:t>
+      </w:r>
+      <w:proofErr w:type="spellEnd"/>
+      <w:r>
+        <w:rPr>
+          <w:rFonts w:ascii="Arial" w:eastAsia="Arial" w:hAnsi="Arial" w:cs="Arial"/>
+        </w:rPr>
+        <w:t xml:space="preserve"> y descontar el stock, PostgreSQL verifica que la versión no haya cambiado; si cambió, se lanza una excepción y se notifica al vendedor que el stock acaba de agotarse.</w:t>
       </w:r>
     </w:p>
     <w:p>
@@ -2460,7 +3703,35 @@
         <w:rPr>
           <w:rFonts w:ascii="Arial" w:eastAsia="Arial" w:hAnsi="Arial" w:cs="Arial"/>
         </w:rPr>
-        <w:t>Respuesta: La clase Pedido registrará el monto_total_tienda. Se debe crear una clase auxiliar LiquidacionComercializadora que procese los pedidos en estado "Entregado" y calcule el "fee" de la plataforma separando los montos de la cuenta por cobrar, manteniendo una trazabilidad contable limpia.</w:t>
+        <w:t xml:space="preserve">Respuesta: La clase Pedido registrará el </w:t>
+      </w:r>
+      <w:proofErr w:type="spellStart"/>
+      <w:r>
+        <w:rPr>
+          <w:rFonts w:ascii="Arial" w:eastAsia="Arial" w:hAnsi="Arial" w:cs="Arial"/>
+        </w:rPr>
+        <w:t>monto_total_tienda</w:t>
+      </w:r>
+      <w:proofErr w:type="spellEnd"/>
+      <w:r>
+        <w:rPr>
+          <w:rFonts w:ascii="Arial" w:eastAsia="Arial" w:hAnsi="Arial" w:cs="Arial"/>
+        </w:rPr>
+        <w:t xml:space="preserve">. Se debe crear una clase auxiliar </w:t>
+      </w:r>
+      <w:proofErr w:type="spellStart"/>
+      <w:r>
+        <w:rPr>
+          <w:rFonts w:ascii="Arial" w:eastAsia="Arial" w:hAnsi="Arial" w:cs="Arial"/>
+        </w:rPr>
+        <w:t>LiquidacionComercializadora</w:t>
+      </w:r>
+      <w:proofErr w:type="spellEnd"/>
+      <w:r>
+        <w:rPr>
+          <w:rFonts w:ascii="Arial" w:eastAsia="Arial" w:hAnsi="Arial" w:cs="Arial"/>
+        </w:rPr>
+        <w:t xml:space="preserve"> que procese los pedidos en estado "Entregado" y calcule el "fee" de la plataforma separando los montos de la cuenta por cobrar, manteniendo una trazabilidad contable limpia.</w:t>
       </w:r>
     </w:p>
     <w:p>
@@ -2502,7 +3773,35 @@
         <w:rPr>
           <w:rFonts w:ascii="Arial" w:eastAsia="Arial" w:hAnsi="Arial" w:cs="Arial"/>
         </w:rPr>
-        <w:t>Respuesta: Se debe evitar un atributo estático en Producto. En su lugar, se implementa una clase CampanaRecompensa que tiene una relación uno a muchos con Producto y posee fechas de vigencia. El modelo calcula los puntos cruzando el DetallePedido con la campaña activa en la fecha del pedido.</w:t>
+        <w:t xml:space="preserve">Respuesta: Se debe evitar un atributo estático en Producto. En su lugar, se implementa una clase </w:t>
+      </w:r>
+      <w:proofErr w:type="spellStart"/>
+      <w:r>
+        <w:rPr>
+          <w:rFonts w:ascii="Arial" w:eastAsia="Arial" w:hAnsi="Arial" w:cs="Arial"/>
+        </w:rPr>
+        <w:t>CampanaRecompensa</w:t>
+      </w:r>
+      <w:proofErr w:type="spellEnd"/>
+      <w:r>
+        <w:rPr>
+          <w:rFonts w:ascii="Arial" w:eastAsia="Arial" w:hAnsi="Arial" w:cs="Arial"/>
+        </w:rPr>
+        <w:t xml:space="preserve"> que tiene una relación uno a muchos con Producto y posee fechas de vigencia. El modelo calcula los puntos cruzando el </w:t>
+      </w:r>
+      <w:proofErr w:type="spellStart"/>
+      <w:r>
+        <w:rPr>
+          <w:rFonts w:ascii="Arial" w:eastAsia="Arial" w:hAnsi="Arial" w:cs="Arial"/>
+        </w:rPr>
+        <w:t>DetallePedido</w:t>
+      </w:r>
+      <w:proofErr w:type="spellEnd"/>
+      <w:r>
+        <w:rPr>
+          <w:rFonts w:ascii="Arial" w:eastAsia="Arial" w:hAnsi="Arial" w:cs="Arial"/>
+        </w:rPr>
+        <w:t xml:space="preserve"> con la campaña activa en la fecha del pedido.</w:t>
       </w:r>
     </w:p>
     <w:p>
@@ -2519,6 +3818,7 @@
           <w:szCs w:val="28"/>
         </w:rPr>
       </w:pPr>
+      <w:bookmarkStart w:id="11" w:name="_Toc231069596"/>
       <w:r>
         <w:rPr>
           <w:rFonts w:ascii="Arial" w:hAnsi="Arial" w:cs="Arial"/>
@@ -2527,6 +3827,7 @@
         </w:rPr>
         <w:t>Diagrama de componentes</w:t>
       </w:r>
+      <w:bookmarkEnd w:id="11"/>
     </w:p>
     <w:p>
       <w:pPr>
@@ -2563,7 +3864,21 @@
           <w:rFonts w:ascii="Arial" w:eastAsia="Arial" w:hAnsi="Arial" w:cs="Arial"/>
         </w:rPr>
         <w:lastRenderedPageBreak/>
-        <w:t>Componente de Interfaz de Usuario (Angular): Módulos de Autenticación, Catálogo, Carrito y Dashboard de Vendedor.</w:t>
+        <w:t xml:space="preserve">Componente de Interfaz de Usuario (Angular): Módulos de Autenticación, Catálogo, Carrito y </w:t>
+      </w:r>
+      <w:proofErr w:type="spellStart"/>
+      <w:r>
+        <w:rPr>
+          <w:rFonts w:ascii="Arial" w:eastAsia="Arial" w:hAnsi="Arial" w:cs="Arial"/>
+        </w:rPr>
+        <w:t>Dashboard</w:t>
+      </w:r>
+      <w:proofErr w:type="spellEnd"/>
+      <w:r>
+        <w:rPr>
+          <w:rFonts w:ascii="Arial" w:eastAsia="Arial" w:hAnsi="Arial" w:cs="Arial"/>
+        </w:rPr>
+        <w:t xml:space="preserve"> de Vendedor.</w:t>
       </w:r>
     </w:p>
     <w:p>
@@ -2584,7 +3899,21 @@
         <w:rPr>
           <w:rFonts w:ascii="Arial" w:eastAsia="Arial" w:hAnsi="Arial" w:cs="Arial"/>
         </w:rPr>
-        <w:t>Componente API Gateway (Django REST Framework): Expone los endpoints seguros mediante JWT.</w:t>
+        <w:t xml:space="preserve">Componente API Gateway (Django REST Framework): Expone los </w:t>
+      </w:r>
+      <w:proofErr w:type="spellStart"/>
+      <w:r>
+        <w:rPr>
+          <w:rFonts w:ascii="Arial" w:eastAsia="Arial" w:hAnsi="Arial" w:cs="Arial"/>
+        </w:rPr>
+        <w:t>endpoints</w:t>
+      </w:r>
+      <w:proofErr w:type="spellEnd"/>
+      <w:r>
+        <w:rPr>
+          <w:rFonts w:ascii="Arial" w:eastAsia="Arial" w:hAnsi="Arial" w:cs="Arial"/>
+        </w:rPr>
+        <w:t xml:space="preserve"> seguros mediante JWT.</w:t>
       </w:r>
     </w:p>
     <w:p>
@@ -2647,7 +3976,49 @@
         <w:rPr>
           <w:rFonts w:ascii="Arial" w:eastAsia="Arial" w:hAnsi="Arial" w:cs="Arial"/>
         </w:rPr>
-        <w:t>Interfaces Externas: APIs RESTful preparadas para recibir webhooks o cargas JSON desde los ERP de las comercializadoras.</w:t>
+        <w:t xml:space="preserve">Interfaces Externas: </w:t>
+      </w:r>
+      <w:proofErr w:type="spellStart"/>
+      <w:r>
+        <w:rPr>
+          <w:rFonts w:ascii="Arial" w:eastAsia="Arial" w:hAnsi="Arial" w:cs="Arial"/>
+        </w:rPr>
+        <w:t>APIs</w:t>
+      </w:r>
+      <w:proofErr w:type="spellEnd"/>
+      <w:r>
+        <w:rPr>
+          <w:rFonts w:ascii="Arial" w:eastAsia="Arial" w:hAnsi="Arial" w:cs="Arial"/>
+        </w:rPr>
+        <w:t xml:space="preserve"> </w:t>
+      </w:r>
+      <w:proofErr w:type="spellStart"/>
+      <w:r>
+        <w:rPr>
+          <w:rFonts w:ascii="Arial" w:eastAsia="Arial" w:hAnsi="Arial" w:cs="Arial"/>
+        </w:rPr>
+        <w:t>RESTful</w:t>
+      </w:r>
+      <w:proofErr w:type="spellEnd"/>
+      <w:r>
+        <w:rPr>
+          <w:rFonts w:ascii="Arial" w:eastAsia="Arial" w:hAnsi="Arial" w:cs="Arial"/>
+        </w:rPr>
+        <w:t xml:space="preserve"> preparadas para recibir </w:t>
+      </w:r>
+      <w:proofErr w:type="spellStart"/>
+      <w:r>
+        <w:rPr>
+          <w:rFonts w:ascii="Arial" w:eastAsia="Arial" w:hAnsi="Arial" w:cs="Arial"/>
+        </w:rPr>
+        <w:t>webhooks</w:t>
+      </w:r>
+      <w:proofErr w:type="spellEnd"/>
+      <w:r>
+        <w:rPr>
+          <w:rFonts w:ascii="Arial" w:eastAsia="Arial" w:hAnsi="Arial" w:cs="Arial"/>
+        </w:rPr>
+        <w:t xml:space="preserve"> o cargas JSON desde los ERP de las comercializadoras.</w:t>
       </w:r>
     </w:p>
     <w:p>
@@ -2664,6 +4035,7 @@
           <w:szCs w:val="28"/>
         </w:rPr>
       </w:pPr>
+      <w:bookmarkStart w:id="12" w:name="_Toc231069597"/>
       <w:r>
         <w:rPr>
           <w:rFonts w:ascii="Arial" w:hAnsi="Arial" w:cs="Arial"/>
@@ -2672,6 +4044,7 @@
         </w:rPr>
         <w:t>Arquitectura lógica y física (propuesta)</w:t>
       </w:r>
+      <w:bookmarkEnd w:id="12"/>
     </w:p>
     <w:p>
       <w:pPr>
@@ -2744,7 +4117,21 @@
         <w:rPr>
           <w:rFonts w:ascii="Arial" w:eastAsia="Arial" w:hAnsi="Arial" w:cs="Arial"/>
         </w:rPr>
-        <w:t>Capa de Presentación / Proxy: Servidor Nginx que sirve los archivos estáticos de Angular y actúa como proxy inverso.</w:t>
+        <w:t xml:space="preserve">Capa de Presentación / Proxy: Servidor </w:t>
+      </w:r>
+      <w:proofErr w:type="spellStart"/>
+      <w:r>
+        <w:rPr>
+          <w:rFonts w:ascii="Arial" w:eastAsia="Arial" w:hAnsi="Arial" w:cs="Arial"/>
+        </w:rPr>
+        <w:t>Nginx</w:t>
+      </w:r>
+      <w:proofErr w:type="spellEnd"/>
+      <w:r>
+        <w:rPr>
+          <w:rFonts w:ascii="Arial" w:eastAsia="Arial" w:hAnsi="Arial" w:cs="Arial"/>
+        </w:rPr>
+        <w:t xml:space="preserve"> que sirve los archivos estáticos de Angular y actúa como proxy inverso.</w:t>
       </w:r>
     </w:p>
     <w:p>
@@ -2765,7 +4152,21 @@
         <w:rPr>
           <w:rFonts w:ascii="Arial" w:eastAsia="Arial" w:hAnsi="Arial" w:cs="Arial"/>
         </w:rPr>
-        <w:t>Capa de Aplicación: Contenedores Docker ejecutando Gunicorn para servir la aplicación Django.</w:t>
+        <w:t xml:space="preserve">Capa de Aplicación: Contenedores Docker ejecutando </w:t>
+      </w:r>
+      <w:proofErr w:type="spellStart"/>
+      <w:r>
+        <w:rPr>
+          <w:rFonts w:ascii="Arial" w:eastAsia="Arial" w:hAnsi="Arial" w:cs="Arial"/>
+        </w:rPr>
+        <w:t>Gunicorn</w:t>
+      </w:r>
+      <w:proofErr w:type="spellEnd"/>
+      <w:r>
+        <w:rPr>
+          <w:rFonts w:ascii="Arial" w:eastAsia="Arial" w:hAnsi="Arial" w:cs="Arial"/>
+        </w:rPr>
+        <w:t xml:space="preserve"> para servir la aplicación Django.</w:t>
       </w:r>
     </w:p>
     <w:p>
@@ -2803,6 +4204,7 @@
           <w:szCs w:val="28"/>
         </w:rPr>
       </w:pPr>
+      <w:bookmarkStart w:id="13" w:name="_Toc231069598"/>
       <w:r>
         <w:rPr>
           <w:rFonts w:ascii="Arial" w:hAnsi="Arial" w:cs="Arial"/>
@@ -2812,6 +4214,7 @@
         <w:lastRenderedPageBreak/>
         <w:t>Prototipo de pantallas no funcional</w:t>
       </w:r>
+      <w:bookmarkEnd w:id="13"/>
     </w:p>
     <w:p>
       <w:pPr>
@@ -2848,11 +4251,19 @@
           <w:rFonts w:ascii="Arial" w:eastAsia="Arial" w:hAnsi="Arial" w:cs="Arial"/>
         </w:rPr>
       </w:pPr>
-      <w:r>
-        <w:rPr>
-          <w:rFonts w:ascii="Arial" w:eastAsia="Arial" w:hAnsi="Arial" w:cs="Arial"/>
-        </w:rPr>
-        <w:t>Dashboard del Vendedor: Resumen rápido del presupuesto de ventas, puntos de gamificación acumulados y comisiones pendientes.</w:t>
+      <w:proofErr w:type="spellStart"/>
+      <w:r>
+        <w:rPr>
+          <w:rFonts w:ascii="Arial" w:eastAsia="Arial" w:hAnsi="Arial" w:cs="Arial"/>
+        </w:rPr>
+        <w:t>Dashboard</w:t>
+      </w:r>
+      <w:proofErr w:type="spellEnd"/>
+      <w:r>
+        <w:rPr>
+          <w:rFonts w:ascii="Arial" w:eastAsia="Arial" w:hAnsi="Arial" w:cs="Arial"/>
+        </w:rPr>
+        <w:t xml:space="preserve"> del Vendedor: Resumen rápido del presupuesto de ventas, puntos de gamificación acumulados y comisiones pendientes.</w:t>
       </w:r>
     </w:p>
     <w:p>
@@ -2894,7 +4305,48 @@
         <w:rPr>
           <w:rFonts w:ascii="Arial" w:eastAsia="Arial" w:hAnsi="Arial" w:cs="Arial"/>
         </w:rPr>
-        <w:t>Registro de Pedido (Checkout): Selección del cliente (Tienda/Micromercado), resumen del carrito y botón de confirmación de pedido.</w:t>
+        <w:t>Registro de Pedido (</w:t>
+      </w:r>
+      <w:proofErr w:type="spellStart"/>
+      <w:r>
+        <w:rPr>
+          <w:rFonts w:ascii="Arial" w:eastAsia="Arial" w:hAnsi="Arial" w:cs="Arial"/>
+        </w:rPr>
+        <w:t>Checkout</w:t>
+      </w:r>
+      <w:proofErr w:type="spellEnd"/>
+      <w:r>
+        <w:rPr>
+          <w:rFonts w:ascii="Arial" w:eastAsia="Arial" w:hAnsi="Arial" w:cs="Arial"/>
+        </w:rPr>
+        <w:t>): Selección del cliente (Tienda/</w:t>
+      </w:r>
+      <w:proofErr w:type="spellStart"/>
+      <w:r>
+        <w:rPr>
+          <w:rFonts w:ascii="Arial" w:eastAsia="Arial" w:hAnsi="Arial" w:cs="Arial"/>
+        </w:rPr>
+        <w:t>Micromercado</w:t>
+      </w:r>
+      <w:proofErr w:type="spellEnd"/>
+      <w:r>
+        <w:rPr>
+          <w:rFonts w:ascii="Arial" w:eastAsia="Arial" w:hAnsi="Arial" w:cs="Arial"/>
+        </w:rPr>
+        <w:t xml:space="preserve">), resumen del carrito y botón de </w:t>
+      </w:r>
+      <w:r>
+        <w:rPr>
+          <w:rFonts w:ascii="Arial" w:eastAsia="Arial" w:hAnsi="Arial" w:cs="Arial"/>
+          <w:u w:val="single"/>
+        </w:rPr>
+        <w:t>confirmación</w:t>
+      </w:r>
+      <w:r>
+        <w:rPr>
+          <w:rFonts w:ascii="Arial" w:eastAsia="Arial" w:hAnsi="Arial" w:cs="Arial"/>
+        </w:rPr>
+        <w:t xml:space="preserve"> de pedido.</w:t>
       </w:r>
     </w:p>
     <w:sectPr>
@@ -5224,7 +6676,6 @@
   <w:rsids>
     <w:rsidRoot w:val="00B53284"/>
     <w:rsid w:val="000F6FFD"/>
-    <w:rsid w:val="00277EE1"/>
     <w:rsid w:val="002F553C"/>
     <w:rsid w:val="00335FE9"/>
     <w:rsid w:val="003B3F64"/>
@@ -5234,6 +6685,7 @@
     <w:rsid w:val="00B53284"/>
     <w:rsid w:val="00B623DA"/>
     <w:rsid w:val="00BA3F2B"/>
+    <w:rsid w:val="00BF094E"/>
     <w:rsid w:val="00D66138"/>
     <w:rsid w:val="00D84BE7"/>
     <w:rsid w:val="00DF2A95"/>

</xml_diff>